<commit_message>
Regenerate department documents from result 27 1300
</commit_message>
<xml_diff>
--- a/version-3/dept-timetables/AIML_Sem1_TimeTable_styled.docx
+++ b/version-3/dept-timetables/AIML_Sem1_TimeTable_styled.docx
@@ -503,7 +503,7 @@
                 <w:b w:val="0"/>
                 <w:sz w:val="15"/>
               </w:rPr>
-              <w:t>D-512</w:t>
+              <w:t>D-501</w:t>
             </w:r>
           </w:p>
         </w:tc>
@@ -612,7 +612,7 @@
                 <w:b/>
                 <w:sz w:val="15"/>
               </w:rPr>
-              <w:t>Library</w:t>
+              <w:t>Mentor</w:t>
             </w:r>
           </w:p>
         </w:tc>
@@ -666,7 +666,7 @@
                 <w:b w:val="0"/>
                 <w:sz w:val="15"/>
               </w:rPr>
-              <w:t>H-402</w:t>
+              <w:t>H-110</w:t>
             </w:r>
           </w:p>
         </w:tc>
@@ -1130,7 +1130,7 @@
                 <w:b w:val="0"/>
                 <w:sz w:val="15"/>
               </w:rPr>
-              <w:t>H-306</w:t>
+              <w:t>H-402</w:t>
             </w:r>
           </w:p>
         </w:tc>
@@ -1213,7 +1213,7 @@
                 <w:b/>
                 <w:sz w:val="15"/>
               </w:rPr>
-              <w:t>PIC</w:t>
+              <w:t>LAC</w:t>
             </w:r>
           </w:p>
           <w:p>
@@ -1226,7 +1226,7 @@
                 <w:b w:val="0"/>
                 <w:sz w:val="15"/>
               </w:rPr>
-              <w:t>Dr. Mannava Yesu Babu</w:t>
+              <w:t>Dr. K. Ramesh</w:t>
             </w:r>
           </w:p>
           <w:p>
@@ -1266,7 +1266,7 @@
                 <w:b/>
                 <w:sz w:val="15"/>
               </w:rPr>
-              <w:t>LAC</w:t>
+              <w:t>PIC</w:t>
             </w:r>
           </w:p>
           <w:p>
@@ -1279,7 +1279,7 @@
                 <w:b w:val="0"/>
                 <w:sz w:val="15"/>
               </w:rPr>
-              <w:t>Dr. K. Ramesh</w:t>
+              <w:t>Dr. Mannava Yesu Babu</w:t>
             </w:r>
           </w:p>
           <w:p>
@@ -1428,7 +1428,7 @@
                 <w:b w:val="0"/>
                 <w:sz w:val="15"/>
               </w:rPr>
-              <w:t>MECT-LAB-01</w:t>
+              <w:t>MECT-LAB-02</w:t>
             </w:r>
           </w:p>
         </w:tc>
@@ -1455,7 +1455,7 @@
                 <w:b/>
                 <w:sz w:val="15"/>
               </w:rPr>
-              <w:t>Mentor</w:t>
+              <w:t>Library</w:t>
             </w:r>
           </w:p>
         </w:tc>
@@ -2371,7 +2371,7 @@
                 <w:b/>
                 <w:sz w:val="16"/>
               </w:rPr>
-              <w:t>Library</w:t>
+              <w:t>Mentor</w:t>
             </w:r>
           </w:p>
         </w:tc>
@@ -2398,7 +2398,7 @@
                 <w:b w:val="0"/>
                 <w:sz w:val="16"/>
               </w:rPr>
-              <w:t>LIBRARY</w:t>
+              <w:t>MENTORING</w:t>
             </w:r>
           </w:p>
         </w:tc>
@@ -2424,7 +2424,7 @@
                 <w:b w:val="0"/>
                 <w:sz w:val="16"/>
               </w:rPr>
-              <w:t>Library</w:t>
+              <w:t>Mentoring</w:t>
             </w:r>
           </w:p>
         </w:tc>
@@ -3342,7 +3342,7 @@
                 <w:b/>
                 <w:sz w:val="16"/>
               </w:rPr>
-              <w:t>Mentor</w:t>
+              <w:t>Library</w:t>
             </w:r>
           </w:p>
         </w:tc>
@@ -3369,7 +3369,7 @@
                 <w:b w:val="0"/>
                 <w:sz w:val="16"/>
               </w:rPr>
-              <w:t>MENTORING</w:t>
+              <w:t>LIBRARY</w:t>
             </w:r>
           </w:p>
         </w:tc>
@@ -3395,7 +3395,7 @@
                 <w:b w:val="0"/>
                 <w:sz w:val="16"/>
               </w:rPr>
-              <w:t>Mentoring</w:t>
+              <w:t>Library</w:t>
             </w:r>
           </w:p>
         </w:tc>
@@ -4345,7 +4345,7 @@
                 <w:b/>
                 <w:sz w:val="15"/>
               </w:rPr>
-              <w:t>PIC</w:t>
+              <w:t>MECT</w:t>
             </w:r>
           </w:p>
           <w:p>
@@ -4358,7 +4358,7 @@
                 <w:b w:val="0"/>
                 <w:sz w:val="15"/>
               </w:rPr>
-              <w:t>Mr. A. Rambabu</w:t>
+              <w:t>Dr.Bathini Srinivas</w:t>
             </w:r>
           </w:p>
           <w:p>
@@ -4398,7 +4398,7 @@
                 <w:b/>
                 <w:sz w:val="15"/>
               </w:rPr>
-              <w:t>MECT</w:t>
+              <w:t>PIC</w:t>
             </w:r>
           </w:p>
           <w:p>
@@ -4411,7 +4411,7 @@
                 <w:b w:val="0"/>
                 <w:sz w:val="15"/>
               </w:rPr>
-              <w:t>Dr.Bathini Srinivas</w:t>
+              <w:t>Mr. A. Rambabu</w:t>
             </w:r>
           </w:p>
           <w:p>
@@ -4616,7 +4616,7 @@
                 <w:b w:val="0"/>
                 <w:sz w:val="15"/>
               </w:rPr>
-              <w:t>H-306</w:t>
+              <w:t>H-110</w:t>
             </w:r>
           </w:p>
         </w:tc>
@@ -4916,7 +4916,7 @@
                 <w:b w:val="0"/>
                 <w:sz w:val="15"/>
               </w:rPr>
-              <w:t>MECT-LAB-01</w:t>
+              <w:t>MECT-LAB-02</w:t>
             </w:r>
           </w:p>
         </w:tc>
@@ -5105,7 +5105,7 @@
                 <w:b w:val="0"/>
                 <w:sz w:val="15"/>
               </w:rPr>
-              <w:t>H-306</w:t>
+              <w:t>H-402</w:t>
             </w:r>
           </w:p>
         </w:tc>
@@ -5381,7 +5381,7 @@
                 <w:b w:val="0"/>
                 <w:sz w:val="15"/>
               </w:rPr>
-              <w:t>D-501</w:t>
+              <w:t>D-308</w:t>
             </w:r>
           </w:p>
         </w:tc>
@@ -6000,7 +6000,7 @@
                 <w:b/>
                 <w:sz w:val="16"/>
               </w:rPr>
-              <w:t>PIC</w:t>
+              <w:t>MECT</w:t>
             </w:r>
           </w:p>
         </w:tc>
@@ -6027,7 +6027,7 @@
                 <w:b w:val="0"/>
                 <w:sz w:val="16"/>
               </w:rPr>
-              <w:t>EMA1X01</w:t>
+              <w:t>EMDXX02</w:t>
             </w:r>
           </w:p>
         </w:tc>
@@ -6053,7 +6053,7 @@
                 <w:b w:val="0"/>
                 <w:sz w:val="16"/>
               </w:rPr>
-              <w:t>Programming in C</w:t>
+              <w:t>Materials, Energy and Chemical Technologies</w:t>
             </w:r>
           </w:p>
         </w:tc>
@@ -6133,7 +6133,7 @@
                 <w:b w:val="0"/>
                 <w:sz w:val="15"/>
               </w:rPr>
-              <w:t>Mr. A. Rambabu</w:t>
+              <w:t>Dr.Bathini Srinivas</w:t>
             </w:r>
           </w:p>
         </w:tc>
@@ -6162,7 +6162,7 @@
                 <w:b/>
                 <w:sz w:val="16"/>
               </w:rPr>
-              <w:t>MECT</w:t>
+              <w:t>PIC</w:t>
             </w:r>
           </w:p>
         </w:tc>
@@ -6189,7 +6189,7 @@
                 <w:b w:val="0"/>
                 <w:sz w:val="16"/>
               </w:rPr>
-              <w:t>EMDXX02</w:t>
+              <w:t>EMA1X01</w:t>
             </w:r>
           </w:p>
         </w:tc>
@@ -6215,7 +6215,7 @@
                 <w:b w:val="0"/>
                 <w:sz w:val="16"/>
               </w:rPr>
-              <w:t>Materials, Energy and Chemical Technologies</w:t>
+              <w:t>Programming in C</w:t>
             </w:r>
           </w:p>
         </w:tc>
@@ -6295,7 +6295,7 @@
                 <w:b w:val="0"/>
                 <w:sz w:val="15"/>
               </w:rPr>
-              <w:t>Dr.Bathini Srinivas</w:t>
+              <w:t>Mr. A. Rambabu</w:t>
             </w:r>
           </w:p>
         </w:tc>
@@ -8599,7 +8599,7 @@
                 <w:b w:val="0"/>
                 <w:sz w:val="15"/>
               </w:rPr>
-              <w:t>MECT-LAB-02</w:t>
+              <w:t>MECT-LAB-01</w:t>
             </w:r>
           </w:p>
         </w:tc>
@@ -9114,7 +9114,7 @@
                 <w:b w:val="0"/>
                 <w:sz w:val="15"/>
               </w:rPr>
-              <w:t>H-306</w:t>
+              <w:t>H-110</w:t>
             </w:r>
           </w:p>
         </w:tc>
@@ -9386,7 +9386,7 @@
                 <w:b w:val="0"/>
                 <w:sz w:val="15"/>
               </w:rPr>
-              <w:t>H-306</w:t>
+              <w:t>H-402</w:t>
             </w:r>
           </w:p>
         </w:tc>
@@ -12987,7 +12987,7 @@
                 <w:b w:val="0"/>
                 <w:sz w:val="15"/>
               </w:rPr>
-              <w:t>H-110</w:t>
+              <w:t>H-306</w:t>
             </w:r>
           </w:p>
         </w:tc>
@@ -13123,7 +13123,7 @@
                 <w:b w:val="0"/>
                 <w:sz w:val="15"/>
               </w:rPr>
-              <w:t>MECT-LAB-02</w:t>
+              <w:t>MECT-LAB-01</w:t>
             </w:r>
           </w:p>
         </w:tc>
@@ -15905,7 +15905,7 @@
                 <w:b w:val="0"/>
                 <w:sz w:val="15"/>
               </w:rPr>
-              <w:t>H-402</w:t>
+              <w:t>H-306</w:t>
             </w:r>
           </w:p>
         </w:tc>
@@ -16068,7 +16068,7 @@
                 <w:b w:val="0"/>
                 <w:sz w:val="15"/>
               </w:rPr>
-              <w:t>MECT-LAB-02</w:t>
+              <w:t>MECT-LAB-01</w:t>
             </w:r>
           </w:p>
         </w:tc>
@@ -19669,7 +19669,7 @@
                 <w:b w:val="0"/>
                 <w:sz w:val="15"/>
               </w:rPr>
-              <w:t>H-306</w:t>
+              <w:t>H-110</w:t>
             </w:r>
           </w:p>
         </w:tc>
@@ -19806,7 +19806,7 @@
                 <w:b/>
                 <w:sz w:val="15"/>
               </w:rPr>
-              <w:t>PIC</w:t>
+              <w:t>GenAI</w:t>
             </w:r>
           </w:p>
           <w:p>
@@ -19819,7 +19819,7 @@
                 <w:b w:val="0"/>
                 <w:sz w:val="15"/>
               </w:rPr>
-              <w:t>Mr. K. Srihari</w:t>
+              <w:t>Mr. A. Rambabu</w:t>
             </w:r>
           </w:p>
           <w:p>
@@ -19859,7 +19859,7 @@
                 <w:b/>
                 <w:sz w:val="15"/>
               </w:rPr>
-              <w:t>GenAI</w:t>
+              <w:t>PIC</w:t>
             </w:r>
           </w:p>
           <w:p>
@@ -19872,7 +19872,7 @@
                 <w:b w:val="0"/>
                 <w:sz w:val="15"/>
               </w:rPr>
-              <w:t>Mr. A. Rambabu</w:t>
+              <w:t>Mr. K. Srihari</w:t>
             </w:r>
           </w:p>
           <w:p>
@@ -20130,7 +20130,7 @@
                 <w:b w:val="0"/>
                 <w:sz w:val="15"/>
               </w:rPr>
-              <w:t>D-501</w:t>
+              <w:t>D-308</w:t>
             </w:r>
           </w:p>
         </w:tc>
@@ -20319,7 +20319,7 @@
                 <w:b w:val="0"/>
                 <w:sz w:val="15"/>
               </w:rPr>
-              <w:t>H-402</w:t>
+              <w:t>H-306</w:t>
             </w:r>
           </w:p>
         </w:tc>

</xml_diff>